<commit_message>
fix: use signer name in contract template
</commit_message>
<xml_diff>
--- a/assets/templates/contract_template.docx
+++ b/assets/templates/contract_template.docx
@@ -525,7 +525,7 @@
           <w:szCs w:val="22"/>
           <w:lang w:val="ru-RU"/>
         </w:rPr>
-        <w:t xml:space="preserve">{{ </w:t>
+        <w:t>{{ client.signer_name }}</w:t>
       </w:r>
       <w:r>
         <w:rPr>
@@ -534,7 +534,6 @@
           <w:sz w:val="22"/>
           <w:szCs w:val="22"/>
         </w:rPr>
-        <w:t>client</w:t>
       </w:r>
       <w:r>
         <w:rPr>
@@ -544,7 +543,6 @@
           <w:szCs w:val="22"/>
           <w:lang w:val="ru-RU"/>
         </w:rPr>
-        <w:t>.</w:t>
       </w:r>
       <w:r>
         <w:rPr>
@@ -553,7 +551,6 @@
           <w:sz w:val="22"/>
           <w:szCs w:val="22"/>
         </w:rPr>
-        <w:t>full</w:t>
       </w:r>
       <w:r>
         <w:rPr>
@@ -563,7 +560,6 @@
           <w:szCs w:val="22"/>
           <w:lang w:val="ru-RU"/>
         </w:rPr>
-        <w:t>_</w:t>
       </w:r>
       <w:r>
         <w:rPr>
@@ -572,7 +568,6 @@
           <w:sz w:val="22"/>
           <w:szCs w:val="22"/>
         </w:rPr>
-        <w:t>name</w:t>
       </w:r>
       <w:r>
         <w:rPr>
@@ -582,7 +577,6 @@
           <w:szCs w:val="22"/>
           <w:lang w:val="ru-RU"/>
         </w:rPr>
-        <w:t xml:space="preserve"> }}</w:t>
       </w:r>
       <w:r>
         <w:rPr>
@@ -7086,7 +7080,7 @@
                 <w:sz w:val="22"/>
                 <w:szCs w:val="22"/>
               </w:rPr>
-              <w:t xml:space="preserve">{{ </w:t>
+              <w:t>{{ client.signer_name }}</w:t>
             </w:r>
             <w:proofErr w:type="spellStart"/>
             <w:r>
@@ -7097,7 +7091,6 @@
                 <w:sz w:val="22"/>
                 <w:szCs w:val="22"/>
               </w:rPr>
-              <w:t>client</w:t>
             </w:r>
             <w:proofErr w:type="gramEnd"/>
             <w:r>
@@ -7108,7 +7101,6 @@
                 <w:sz w:val="22"/>
                 <w:szCs w:val="22"/>
               </w:rPr>
-              <w:t>.full_name</w:t>
             </w:r>
             <w:proofErr w:type="spellEnd"/>
             <w:r>
@@ -7119,7 +7111,6 @@
                 <w:sz w:val="22"/>
                 <w:szCs w:val="22"/>
               </w:rPr>
-              <w:t xml:space="preserve"> }}</w:t>
             </w:r>
           </w:p>
         </w:tc>
@@ -7179,6 +7170,9 @@
     </w:p>
     <w:sectPr>
       <w:footerReference w:type="default" r:id="rId8"/>
+      <w:headerReference w:type="default" r:id="rId11"/>
+      <w:headerReference w:type="first" r:id="rId12"/>
+      <w:footerReference w:type="first" r:id="rId13"/>
       <w:pgSz w:w="11906" w:h="16838"/>
       <w:pgMar w:top="510" w:right="720" w:bottom="454" w:left="720" w:header="709" w:footer="709" w:gutter="0"/>
       <w:pgNumType w:fmt="numberInDash"/>
@@ -7240,6 +7234,16 @@
 </w:ftr>
 </file>
 
+<file path=word/footer2.xml><?xml version="1.0" encoding="utf-8"?>
+<w:ftr xmlns:m="http://schemas.openxmlformats.org/officeDocument/2006/math" xmlns:mc="http://schemas.openxmlformats.org/markup-compatibility/2006" xmlns:mo="http://schemas.microsoft.com/office/mac/office/2008/main" xmlns:mv="urn:schemas-microsoft-com:mac:vml" xmlns:o="urn:schemas-microsoft-com:office:office" xmlns:r="http://schemas.openxmlformats.org/officeDocument/2006/relationships" xmlns:v="urn:schemas-microsoft-com:vml" xmlns:w10="urn:schemas-microsoft-com:office:word" xmlns:w14="http://schemas.microsoft.com/office/word/2010/wordml" xmlns:w="http://schemas.openxmlformats.org/wordprocessingml/2006/main" xmlns:wne="http://schemas.microsoft.com/office/word/2006/wordml" xmlns:wp14="http://schemas.microsoft.com/office/word/2010/wordprocessingDrawing" xmlns:wp="http://schemas.openxmlformats.org/drawingml/2006/wordprocessingDrawing" xmlns:wpc="http://schemas.microsoft.com/office/word/2010/wordprocessingCanvas" xmlns:wpg="http://schemas.microsoft.com/office/word/2010/wordprocessingGroup" xmlns:wpi="http://schemas.microsoft.com/office/word/2010/wordprocessingInk" xmlns:wps="http://schemas.microsoft.com/office/word/2010/wordprocessingShape" mc:Ignorable="w14 wp14">
+  <w:p>
+    <w:pPr>
+      <w:pStyle w:val="Footer"/>
+    </w:pPr>
+  </w:p>
+</w:ftr>
+</file>
+
 <file path=word/footnotes.xml><?xml version="1.0" encoding="utf-8"?>
 <w:footnotes xmlns:wpc="http://schemas.microsoft.com/office/word/2010/wordprocessingCanvas" xmlns:cx="http://schemas.microsoft.com/office/drawing/2014/chartex" xmlns:cx1="http://schemas.microsoft.com/office/drawing/2015/9/8/chartex" xmlns:cx2="http://schemas.microsoft.com/office/drawing/2015/10/21/chartex" xmlns:cx3="http://schemas.microsoft.com/office/drawing/2016/5/9/chartex" xmlns:cx4="http://schemas.microsoft.com/office/drawing/2016/5/10/chartex" xmlns:cx5="http://schemas.microsoft.com/office/drawing/2016/5/11/chartex" xmlns:cx6="http://schemas.microsoft.com/office/drawing/2016/5/12/chartex" xmlns:cx7="http://schemas.microsoft.com/office/drawing/2016/5/13/chartex" xmlns:cx8="http://schemas.microsoft.com/office/drawing/2016/5/14/chartex" xmlns:mc="http://schemas.openxmlformats.org/markup-compatibility/2006" xmlns:aink="http://schemas.microsoft.com/office/drawing/2016/ink" xmlns:am3d="http://schemas.microsoft.com/office/drawing/2017/model3d" xmlns:o="urn:schemas-microsoft-com:office:office" xmlns:r="http://schemas.openxmlformats.org/officeDocument/2006/relationships" xmlns:m="http://schemas.openxmlformats.org/officeDocument/2006/math" xmlns:v="urn:schemas-microsoft-com:vml" xmlns:wp14="http://schemas.microsoft.com/office/word/2010/wordprocessingDrawing" xmlns:wp="http://schemas.openxmlformats.org/drawingml/2006/wordprocessingDrawing" xmlns:w10="urn:schemas-microsoft-com:office:word" xmlns:w="http://schemas.openxmlformats.org/wordprocessingml/2006/main" xmlns:w14="http://schemas.microsoft.com/office/word/2010/wordml" xmlns:w15="http://schemas.microsoft.com/office/word/2012/wordml" xmlns:w16cex="http://schemas.microsoft.com/office/word/2018/wordml/cex" xmlns:w16cid="http://schemas.microsoft.com/office/word/2016/wordml/cid" xmlns:w16="http://schemas.microsoft.com/office/word/2018/wordml" xmlns:w16sdtdh="http://schemas.microsoft.com/office/word/2020/wordml/sdtdatahash" xmlns:w16se="http://schemas.microsoft.com/office/word/2015/wordml/symex" xmlns:wpg="http://schemas.microsoft.com/office/word/2010/wordprocessingGroup" xmlns:wpi="http://schemas.microsoft.com/office/word/2010/wordprocessingInk" xmlns:wne="http://schemas.microsoft.com/office/word/2006/wordml" xmlns:wps="http://schemas.microsoft.com/office/word/2010/wordprocessingShape" mc:Ignorable="w14 w15 w16se w16cid w16 w16cex w16sdtdh wp14">
   <w:footnote w:type="separator" w:id="-1">
@@ -7257,6 +7261,26 @@
     </w:p>
   </w:footnote>
 </w:footnotes>
+</file>
+
+<file path=word/header1.xml><?xml version="1.0" encoding="utf-8"?>
+<w:hdr xmlns:m="http://schemas.openxmlformats.org/officeDocument/2006/math" xmlns:mc="http://schemas.openxmlformats.org/markup-compatibility/2006" xmlns:mo="http://schemas.microsoft.com/office/mac/office/2008/main" xmlns:mv="urn:schemas-microsoft-com:mac:vml" xmlns:o="urn:schemas-microsoft-com:office:office" xmlns:r="http://schemas.openxmlformats.org/officeDocument/2006/relationships" xmlns:v="urn:schemas-microsoft-com:vml" xmlns:w10="urn:schemas-microsoft-com:office:word" xmlns:w14="http://schemas.microsoft.com/office/word/2010/wordml" xmlns:w="http://schemas.openxmlformats.org/wordprocessingml/2006/main" xmlns:wne="http://schemas.microsoft.com/office/word/2006/wordml" xmlns:wp14="http://schemas.microsoft.com/office/word/2010/wordprocessingDrawing" xmlns:wp="http://schemas.openxmlformats.org/drawingml/2006/wordprocessingDrawing" xmlns:wpc="http://schemas.microsoft.com/office/word/2010/wordprocessingCanvas" xmlns:wpg="http://schemas.microsoft.com/office/word/2010/wordprocessingGroup" xmlns:wpi="http://schemas.microsoft.com/office/word/2010/wordprocessingInk" xmlns:wps="http://schemas.microsoft.com/office/word/2010/wordprocessingShape" mc:Ignorable="w14 wp14">
+  <w:p>
+    <w:pPr>
+      <w:pStyle w:val="Header"/>
+    </w:pPr>
+  </w:p>
+</w:hdr>
+</file>
+
+<file path=word/header2.xml><?xml version="1.0" encoding="utf-8"?>
+<w:hdr xmlns:m="http://schemas.openxmlformats.org/officeDocument/2006/math" xmlns:mc="http://schemas.openxmlformats.org/markup-compatibility/2006" xmlns:mo="http://schemas.microsoft.com/office/mac/office/2008/main" xmlns:mv="urn:schemas-microsoft-com:mac:vml" xmlns:o="urn:schemas-microsoft-com:office:office" xmlns:r="http://schemas.openxmlformats.org/officeDocument/2006/relationships" xmlns:v="urn:schemas-microsoft-com:vml" xmlns:w10="urn:schemas-microsoft-com:office:word" xmlns:w14="http://schemas.microsoft.com/office/word/2010/wordml" xmlns:w="http://schemas.openxmlformats.org/wordprocessingml/2006/main" xmlns:wne="http://schemas.microsoft.com/office/word/2006/wordml" xmlns:wp14="http://schemas.microsoft.com/office/word/2010/wordprocessingDrawing" xmlns:wp="http://schemas.openxmlformats.org/drawingml/2006/wordprocessingDrawing" xmlns:wpc="http://schemas.microsoft.com/office/word/2010/wordprocessingCanvas" xmlns:wpg="http://schemas.microsoft.com/office/word/2010/wordprocessingGroup" xmlns:wpi="http://schemas.microsoft.com/office/word/2010/wordprocessingInk" xmlns:wps="http://schemas.microsoft.com/office/word/2010/wordprocessingShape" mc:Ignorable="w14 wp14">
+  <w:p>
+    <w:pPr>
+      <w:pStyle w:val="Header"/>
+    </w:pPr>
+  </w:p>
+</w:hdr>
 </file>
 
 <file path=word/numbering.xml><?xml version="1.0" encoding="utf-8"?>

</xml_diff>

<commit_message>
T01: port reviewed document foundation without private history
Autopilot-Run: 2026-10-30-local-document-workflows
Requirements: R03,R04,R07,R08,R10,G08
</commit_message>
<xml_diff>
--- a/assets/templates/contract_template.docx
+++ b/assets/templates/contract_template.docx
@@ -220,12 +220,92 @@
       <w:r>
         <w:rPr>
           <w:rFonts w:ascii="Times New Roman" w:hAnsi="Times New Roman"/>
-          <w:b/>
-          <w:sz w:val="22"/>
-          <w:szCs w:val="22"/>
-          <w:lang w:val="ru-RU"/>
-        </w:rPr>
-        <w:t xml:space="preserve">  ООО "СМ ТЕХНО", именуемое в дальнейшем «Поставщик», в лице генерального директора Дыбаева Александра Александровича, действующего на основании Устава, с одной стороны, и {{ client.document_name }}, в лице {{ client.signer_position_genitive }} {{ client.signer_name_genitive }}, действующего на основании {{ client.signer_basis }}, именуемое в дальнейшем «Покупатель», с другой стороны, совместно именуемые в дальнейшем  «Стороны», а по отдельности – «Сторона», заключили настоящий договор поставки (далее «Договор») о нижеследующем:</w:t>
+          <w:sz w:val="22"/>
+          <w:szCs w:val="22"/>
+          <w:lang w:val="ru-RU"/>
+          <w:b w:val="0"/>
+        </w:rPr>
+        <w:t xml:space="preserve">  </w:t>
+      </w:r>
+      <w:r>
+        <w:rPr>
+          <w:rFonts w:ascii="Times New Roman" w:hAnsi="Times New Roman"/>
+          <w:sz w:val="22"/>
+          <w:szCs w:val="22"/>
+          <w:lang w:val="ru-RU"/>
+          <w:b w:val="1"/>
+        </w:rPr>
+        <w:t xml:space="preserve">ООО "СМ ТЕХНО"</w:t>
+      </w:r>
+      <w:r>
+        <w:rPr>
+          <w:rFonts w:ascii="Times New Roman" w:hAnsi="Times New Roman"/>
+          <w:sz w:val="22"/>
+          <w:szCs w:val="22"/>
+          <w:lang w:val="ru-RU"/>
+          <w:b w:val="0"/>
+        </w:rPr>
+        <w:t xml:space="preserve">, именуемое в дальнейшем «Поставщик», в лице генерального директора </w:t>
+      </w:r>
+      <w:r>
+        <w:rPr>
+          <w:rFonts w:ascii="Times New Roman" w:hAnsi="Times New Roman"/>
+          <w:sz w:val="22"/>
+          <w:szCs w:val="22"/>
+          <w:lang w:val="ru-RU"/>
+          <w:b w:val="1"/>
+        </w:rPr>
+        <w:t xml:space="preserve">Дыбаева Александра Александровича</w:t>
+      </w:r>
+      <w:r>
+        <w:rPr>
+          <w:rFonts w:ascii="Times New Roman" w:hAnsi="Times New Roman"/>
+          <w:sz w:val="22"/>
+          <w:szCs w:val="22"/>
+          <w:lang w:val="ru-RU"/>
+          <w:b w:val="0"/>
+        </w:rPr>
+        <w:t xml:space="preserve">, действующего на основании Устава, с одной стороны, и </w:t>
+      </w:r>
+      <w:r>
+        <w:rPr>
+          <w:rFonts w:ascii="Times New Roman" w:hAnsi="Times New Roman"/>
+          <w:sz w:val="22"/>
+          <w:szCs w:val="22"/>
+          <w:lang w:val="ru-RU"/>
+          <w:b w:val="1"/>
+        </w:rPr>
+        <w:t xml:space="preserve">{{ client.document_name }}</w:t>
+      </w:r>
+      <w:r>
+        <w:rPr>
+          <w:rFonts w:ascii="Times New Roman" w:hAnsi="Times New Roman"/>
+          <w:sz w:val="22"/>
+          <w:szCs w:val="22"/>
+          <w:lang w:val="ru-RU"/>
+          <w:b w:val="0"/>
+        </w:rPr>
+        <w:t xml:space="preserve">, в лице {{ client.signer_position_genitive }} </w:t>
+      </w:r>
+      <w:r>
+        <w:rPr>
+          <w:rFonts w:ascii="Times New Roman" w:hAnsi="Times New Roman"/>
+          <w:sz w:val="22"/>
+          <w:szCs w:val="22"/>
+          <w:lang w:val="ru-RU"/>
+          <w:b w:val="1"/>
+        </w:rPr>
+        <w:t xml:space="preserve">{{ client.signer_name_genitive }}</w:t>
+      </w:r>
+      <w:r>
+        <w:rPr>
+          <w:rFonts w:ascii="Times New Roman" w:hAnsi="Times New Roman"/>
+          <w:sz w:val="22"/>
+          <w:szCs w:val="22"/>
+          <w:lang w:val="ru-RU"/>
+          <w:b w:val="0"/>
+        </w:rPr>
+        <w:t xml:space="preserve">, действующего на основании {{ client.signer_basis }}, именуемое в дальнейшем «Покупатель», с другой стороны, совместно именуемые в дальнейшем  «Стороны», а по отдельности – «Сторона», заключили настоящий договор поставки (далее «Договор») о нижеследующем:</w:t>
       </w:r>
       <w:r>
         <w:rPr>

</xml_diff>